<commit_message>
docs: 使用说明（Word）同步改名 dsh-calibration-tier + 版本 2.0.0
</commit_message>
<xml_diff>
--- a/docs/使用说明.docx
+++ b/docs/使用说明.docx
@@ -13,7 +13,7 @@
           <w:color w:val="2F2A45"/>
           <w:sz w:val="44"/>
         </w:rPr>
-        <w:t>dsh-calibration 使用说明</w:t>
+        <w:t>dsh-calibration-tier 使用说明</w:t>
       </w:r>
     </w:p>
     <w:p>
@@ -39,7 +39,7 @@
           <w:color w:val="7A7488"/>
           <w:sz w:val="18"/>
         </w:rPr>
-        <w:t>版本 1.9.0 · 适用：DSH Desktop / DSH NEXT（带 Web 客户端插件支持的版本）</w:t>
+        <w:t>版本 2.0.0 · 适用：DSH Desktop / DSH NEXT（带 Web 客户端插件支持的版本）</w:t>
       </w:r>
     </w:p>
     <w:p/>
@@ -991,7 +991,7 @@
           <w:b w:val="0"/>
           <w:sz w:val="21"/>
         </w:rPr>
-        <w:t>1. 拿到文件夹：把整个 dsh-calibration 文件夹放到任意目录（例如 D:\Tools\dsh-calibration）。文件夹里应有 package.json、lib\、cordis.patch.yml。</w:t>
+        <w:t>1. 拿到文件夹：把整个 dsh-calibration-tier 文件夹放到任意目录（例如 D:\Tools\dsh-calibration-tier）。文件夹里应有 package.json、lib\、cordis.patch.yml。</w:t>
       </w:r>
     </w:p>
     <w:p>
@@ -1029,7 +1029,7 @@
           <w:b w:val="0"/>
           <w:sz w:val="21"/>
         </w:rPr>
-        <w:t>脚本会做三件事（每一步都打印，并先备份 profile 的 package.json）：在 profile 的 dependencies 里加一条 link: 依赖；把包名 @local/dsh-calibration 追加进 dsh.profile.bundles；在 profile 的 node_modules 下建链接。</w:t>
+        <w:t>脚本会做三件事（每一步都打印，并先备份 profile 的 package.json）：在 profile 的 dependencies 里加一条 link: 依赖；把包名 @local/dsh-calibration-tier 追加进 dsh.profile.bundles；在 profile 的 node_modules 下建链接。</w:t>
       </w:r>
     </w:p>
     <w:p>
@@ -1667,7 +1667,7 @@
           <w:b w:val="0"/>
           <w:sz w:val="21"/>
         </w:rPr>
-        <w:t>当前 1.9.0。变更记录见仓库 CHANGELOG.md，发布说明见 docs/release-notes.md。</w:t>
+        <w:t>当前 2.0.0。变更记录见仓库 CHANGELOG.md，发布说明见 docs/release-notes.md。</w:t>
       </w:r>
     </w:p>
     <w:sectPr>

</xml_diff>

<commit_message>
feat: 3.2.0 检索/代理模式 + agent_delegate + verify_claims；包名转公开（3.2.1）
- 五模式档位条：思考 / 循环 / 对抗 / 检索（增量·全量）/ 代理（效率·性能）
- agent_delegate：spawn / claude-code / codex 三后端，自配 API 预检失败或起不来时回退官方并提醒；efforts 按模型声明传
- verify_claims：断言对文件行（±3）与 URL 取证
- 包名 @local/dsh-calibration-tier → dsh-calibration-tier，去 private，补 repository/homepage/bugs/keywords，准备发 npm
- 客户端 bundle id、cordis name、安装脚本、测试同步；测试 130 全过
</commit_message>
<xml_diff>
--- a/docs/使用说明.docx
+++ b/docs/使用说明.docx
@@ -126,7 +126,7 @@
         <w:rPr>
           <w:sz w:val="21"/>
         </w:rPr>
-        <w:t>这条档位条把「用力程度」做成可以随时拨的三档，并把「循环打磨」和「对抗审查」做成可以叠加的两种模式：</w:t>
+        <w:t>这条档位条把「用力程度」做成可以随时拨的三档，并把「循环打磨」「对抗审查」「检索找技能」「派子代理」做成可以叠加的开关：</w:t>
       </w:r>
     </w:p>
     <w:tbl>
@@ -352,6 +352,36 @@
           </w:p>
         </w:tc>
       </w:tr>
+      <w:tr>
+        <w:tc>
+          <w:tcPr>
+            <w:tcW w:type="dxa" w:w="4824"/>
+          </w:tcPr>
+          <w:p>
+            <w:r/>
+            <w:r>
+              <w:rPr>
+                <w:sz w:val="19"/>
+              </w:rPr>
+              <w:t>想让子代理按模块用不同模型、还要有人独立挑刺</w:t>
+            </w:r>
+          </w:p>
+        </w:tc>
+        <w:tc>
+          <w:tcPr>
+            <w:tcW w:type="dxa" w:w="4824"/>
+          </w:tcPr>
+          <w:p>
+            <w:r/>
+            <w:r>
+              <w:rPr>
+                <w:sz w:val="19"/>
+              </w:rPr>
+              <w:t>任意模式 + 代理（效率 / 性能） + 对抗</w:t>
+            </w:r>
+          </w:p>
+        </w:tc>
+      </w:tr>
     </w:tbl>
     <w:p/>
     <w:p>
@@ -368,7 +398,7 @@
           <w:rFonts w:ascii="Consolas" w:hAnsi="Consolas"/>
           <w:sz w:val="20"/>
         </w:rPr>
-        <w:t>思考：  [常规] [严格] [极致]  ‖  [循环]  [对抗]  [检索]</w:t>
+        <w:t>思考：  [常规] [严格] [极致]  ‖  [循环]  [对抗]  [检索]  [代理]</w:t>
       </w:r>
     </w:p>
     <w:p>
@@ -377,7 +407,7 @@
           <w:rFonts w:ascii="Consolas" w:hAnsi="Consolas"/>
           <w:sz w:val="20"/>
         </w:rPr>
-        <w:t>循环：  [轻量] [交付] [极致]  ‖  [循环]亮 [对抗]  [检索]</w:t>
+        <w:t>循环：  [轻量] [交付] [极致]  ‖  [循环]亮 [对抗]  [检索]  [代理]</w:t>
       </w:r>
     </w:p>
     <w:p>
@@ -386,7 +416,16 @@
           <w:rFonts w:ascii="Consolas" w:hAnsi="Consolas"/>
           <w:sz w:val="20"/>
         </w:rPr>
-        <w:t>检索：  [本地] [增量] [全量] ‖  [常规] [严格] [极致] ‖ [循环] [对抗] [检索]亮</w:t>
+        <w:t>检索开：[增量] [全量] ‖ [常规] [严格] [极致] ‖ [循环] [对抗] [检索]亮 [代理]</w:t>
+      </w:r>
+    </w:p>
+    <w:p>
+      <w:r>
+        <w:rPr>
+          <w:rFonts w:ascii="Consolas" w:hAnsi="Consolas"/>
+          <w:sz w:val="20"/>
+        </w:rPr>
+        <w:t>代理开：… [代理]亮 [效率] [性能]      ← 宽屏且检索关；窄屏或检索开时收成一格轮换</w:t>
       </w:r>
     </w:p>
     <w:p>
@@ -423,7 +462,7 @@
           <w:b/>
           <w:sz w:val="21"/>
         </w:rPr>
-        <w:t>可以拨的三个开关</w:t>
+        <w:t>可以拨的四个开关</w:t>
       </w:r>
       <w:r>
         <w:rPr>
@@ -483,7 +522,38 @@
         <w:rPr>
           <w:sz w:val="21"/>
         </w:rPr>
-        <w:t>：叠加开关。打开后最左侧多出「本地 / 增量 / 全量」三格，思考档与循环档都还在；</w:t>
+        <w:t>：叠加开关。打开后最左侧多出「增量 / 全量」两格，思考档与循环档都还在；</w:t>
+      </w:r>
+      <w:r>
+        <w:rPr>
+          <w:b/>
+          <w:sz w:val="21"/>
+        </w:rPr>
+        <w:t>关掉就是不检索，也就是本地行为</w:t>
+      </w:r>
+      <w:r>
+        <w:rPr>
+          <w:sz w:val="21"/>
+        </w:rPr>
+        <w:t>（所以不再单独留一格「本地」）；</w:t>
+      </w:r>
+    </w:p>
+    <w:p>
+      <w:pPr>
+        <w:pStyle w:val="ListBullet"/>
+      </w:pPr>
+      <w:r>
+        <w:rPr>
+          <w:b/>
+          <w:sz w:val="21"/>
+        </w:rPr>
+        <w:t>代理</w:t>
+      </w:r>
+      <w:r>
+        <w:rPr>
+          <w:sz w:val="21"/>
+        </w:rPr>
+        <w:t>：叠加开关。打开后右侧多出「效率 / 性能」两格（窄屏或检索开时收成一格轮换）。关掉就是官方默认：不指定模型、不改白名单。开着时模型会按模块（派活 / 评审 / 对抗 / 检索）自动挑模型，对抗还会强制换一家 provider 来避免「自己审自己」；</w:t>
       </w:r>
     </w:p>
     <w:p>
@@ -501,7 +571,7 @@
         <w:rPr>
           <w:sz w:val="21"/>
         </w:rPr>
-        <w:t>：循环和对抗同时亮起时，左边三格的选中格由绿转橙（红 + 绿 中和），一眼看出这一轮是「边磨边审」；循环开关仍绿、对抗开关仍红，检索常驻天蓝。</w:t>
+        <w:t>：循环和对抗同时亮起时，左边三格的选中格由绿转橙（红 + 绿 中和），一眼看出这一轮是「边磨边审」；循环开关仍绿、对抗开关仍红、检索常驻天蓝、代理常驻紫红。</w:t>
       </w:r>
     </w:p>
     <w:p>
@@ -931,7 +1001,7 @@
           <w:b/>
           <w:sz w:val="21"/>
         </w:rPr>
-        <w:t>检索三档（检索开关）</w:t>
+        <w:t>检索两档（检索开关）</w:t>
       </w:r>
     </w:p>
     <w:tbl>
@@ -989,63 +1059,6 @@
                 <w:sz w:val="19"/>
               </w:rPr>
               <w:t>联网</w:t>
-            </w:r>
-          </w:p>
-        </w:tc>
-      </w:tr>
-      <w:tr>
-        <w:tc>
-          <w:tcPr>
-            <w:tcW w:type="dxa" w:w="3216"/>
-          </w:tcPr>
-          <w:p>
-            <w:r/>
-            <w:r>
-              <w:rPr>
-                <w:sz w:val="19"/>
-              </w:rPr>
-              <w:t>本地</w:t>
-            </w:r>
-          </w:p>
-        </w:tc>
-        <w:tc>
-          <w:tcPr>
-            <w:tcW w:type="dxa" w:w="3216"/>
-          </w:tcPr>
-          <w:p>
-            <w:r/>
-            <w:r>
-              <w:rPr>
-                <w:sz w:val="19"/>
-              </w:rPr>
-              <w:t xml:space="preserve">只用已装技能，命中隐藏技能时会先 </w:t>
-            </w:r>
-            <w:r>
-              <w:rPr>
-                <w:rFonts w:ascii="Consolas" w:hAnsi="Consolas"/>
-                <w:sz w:val="19"/>
-              </w:rPr>
-              <w:t>read</w:t>
-            </w:r>
-            <w:r>
-              <w:rPr>
-                <w:sz w:val="19"/>
-              </w:rPr>
-              <w:t xml:space="preserve"> 它的说明</w:t>
-            </w:r>
-          </w:p>
-        </w:tc>
-        <w:tc>
-          <w:tcPr>
-            <w:tcW w:type="dxa" w:w="3216"/>
-          </w:tcPr>
-          <w:p>
-            <w:r/>
-            <w:r>
-              <w:rPr>
-                <w:sz w:val="19"/>
-              </w:rPr>
-              <w:t>不联网</w:t>
             </w:r>
           </w:p>
         </w:tc>
@@ -1140,6 +1153,34 @@
       </w:tr>
     </w:tbl>
     <w:p/>
+    <w:p>
+      <w:r>
+        <w:rPr>
+          <w:b/>
+          <w:sz w:val="21"/>
+        </w:rPr>
+        <w:t>不检索就是本地</w:t>
+      </w:r>
+      <w:r>
+        <w:rPr>
+          <w:sz w:val="21"/>
+        </w:rPr>
+        <w:t xml:space="preserve">：关掉开关时只用已装技能，命中隐藏技能会先 </w:t>
+      </w:r>
+      <w:r>
+        <w:rPr>
+          <w:rFonts w:ascii="Consolas" w:hAnsi="Consolas"/>
+          <w:sz w:val="21"/>
+        </w:rPr>
+        <w:t>read</w:t>
+      </w:r>
+      <w:r>
+        <w:rPr>
+          <w:sz w:val="21"/>
+        </w:rPr>
+        <w:t xml:space="preserve"> 它的说明。</w:t>
+      </w:r>
+    </w:p>
     <w:p>
       <w:r>
         <w:rPr>
@@ -1292,6 +1333,230 @@
       </w:tr>
     </w:tbl>
     <w:p/>
+    <w:p>
+      <w:r>
+        <w:rPr>
+          <w:b/>
+          <w:sz w:val="21"/>
+        </w:rPr>
+        <w:t>代理与 agent_delegate（v3.1.0）</w:t>
+      </w:r>
+    </w:p>
+    <w:p>
+      <w:r>
+        <w:rPr>
+          <w:sz w:val="21"/>
+        </w:rPr>
+        <w:t xml:space="preserve">官方 </w:t>
+      </w:r>
+      <w:r>
+        <w:rPr>
+          <w:rFonts w:ascii="Consolas" w:hAnsi="Consolas"/>
+          <w:sz w:val="21"/>
+        </w:rPr>
+        <w:t>subagent</w:t>
+      </w:r>
+      <w:r>
+        <w:rPr>
+          <w:sz w:val="21"/>
+        </w:rPr>
+        <w:t xml:space="preserve"> 的模型白名单在</w:t>
+      </w:r>
+      <w:r>
+        <w:rPr>
+          <w:b/>
+          <w:sz w:val="21"/>
+        </w:rPr>
+        <w:t>会话创建时</w:t>
+      </w:r>
+      <w:r>
+        <w:rPr>
+          <w:sz w:val="21"/>
+        </w:rPr>
+        <w:t xml:space="preserve">就定死了，改配置只对新会话生效。所以想让「当前这个对话」就用上你自配的 API，用 </w:t>
+      </w:r>
+      <w:r>
+        <w:rPr>
+          <w:rFonts w:ascii="Consolas" w:hAnsi="Consolas"/>
+          <w:sz w:val="21"/>
+        </w:rPr>
+        <w:t>agent_delegate</w:t>
+      </w:r>
+      <w:r>
+        <w:rPr>
+          <w:sz w:val="21"/>
+        </w:rPr>
+        <w:t>：</w:t>
+      </w:r>
+    </w:p>
+    <w:p>
+      <w:pPr>
+        <w:pStyle w:val="ListBullet"/>
+      </w:pPr>
+      <w:r>
+        <w:rPr>
+          <w:sz w:val="21"/>
+        </w:rPr>
+        <w:t>只需要说清任务和模块（派活 / 评审 / 对抗 / 检索），模型自动挑；</w:t>
+      </w:r>
+    </w:p>
+    <w:p>
+      <w:pPr>
+        <w:pStyle w:val="ListBullet"/>
+      </w:pPr>
+      <w:r>
+        <w:rPr>
+          <w:sz w:val="21"/>
+        </w:rPr>
+        <w:t>也可以点名要哪个模型（provider + model）；</w:t>
+      </w:r>
+    </w:p>
+    <w:p>
+      <w:pPr>
+        <w:pStyle w:val="ListBullet"/>
+      </w:pPr>
+      <w:r>
+        <w:rPr>
+          <w:sz w:val="21"/>
+        </w:rPr>
+        <w:t>它</w:t>
+      </w:r>
+      <w:r>
+        <w:rPr>
+          <w:b/>
+          <w:sz w:val="21"/>
+        </w:rPr>
+        <w:t>不受白名单限制</w:t>
+      </w:r>
+      <w:r>
+        <w:rPr>
+          <w:sz w:val="21"/>
+        </w:rPr>
+        <w:t>，代价是没有额度护栏——批量跑之前先估一下成本。</w:t>
+      </w:r>
+    </w:p>
+    <w:p>
+      <w:pPr>
+        <w:pStyle w:val="ListBullet"/>
+      </w:pPr>
+      <w:r>
+        <w:rPr>
+          <w:b/>
+          <w:sz w:val="21"/>
+        </w:rPr>
+        <w:t>自配 API 出意外会自动回退</w:t>
+      </w:r>
+      <w:r>
+        <w:rPr>
+          <w:sz w:val="21"/>
+        </w:rPr>
+        <w:t>：预检或启动失败时会换官方 deepseek 模型重试一次，返回第一句就是「⚠️ 已回退」，告诉你是谁不可用、退到了哪。</w:t>
+      </w:r>
+    </w:p>
+    <w:p>
+      <w:pPr>
+        <w:pStyle w:val="ListBullet"/>
+      </w:pPr>
+      <w:r>
+        <w:rPr>
+          <w:sz w:val="21"/>
+        </w:rPr>
+        <w:t>还能选运行时：</w:t>
+      </w:r>
+      <w:r>
+        <w:rPr>
+          <w:rFonts w:ascii="Consolas" w:hAnsi="Consolas"/>
+          <w:sz w:val="21"/>
+        </w:rPr>
+        <w:t>spawn</w:t>
+      </w:r>
+      <w:r>
+        <w:rPr>
+          <w:sz w:val="21"/>
+        </w:rPr>
+        <w:t xml:space="preserve">（默认，能换模型）/ </w:t>
+      </w:r>
+      <w:r>
+        <w:rPr>
+          <w:rFonts w:ascii="Consolas" w:hAnsi="Consolas"/>
+          <w:sz w:val="21"/>
+        </w:rPr>
+        <w:t>claude-code</w:t>
+      </w:r>
+      <w:r>
+        <w:rPr>
+          <w:sz w:val="21"/>
+        </w:rPr>
+        <w:t xml:space="preserve"> / </w:t>
+      </w:r>
+      <w:r>
+        <w:rPr>
+          <w:rFonts w:ascii="Consolas" w:hAnsi="Consolas"/>
+          <w:sz w:val="21"/>
+        </w:rPr>
+        <w:t>codex</w:t>
+      </w:r>
+      <w:r>
+        <w:rPr>
+          <w:sz w:val="21"/>
+        </w:rPr>
+        <w:t>（用它们各自的 CLI 与登录态，模型由 CLI 配置决定，不能在这里切）。</w:t>
+      </w:r>
+    </w:p>
+    <w:p>
+      <w:r>
+        <w:rPr>
+          <w:b/>
+          <w:sz w:val="21"/>
+        </w:rPr>
+        <w:t>对抗 v2（2026-10-28 起）</w:t>
+      </w:r>
+      <w:r>
+        <w:rPr>
+          <w:sz w:val="21"/>
+        </w:rPr>
+        <w:t>：代理开着时，对抗由</w:t>
+      </w:r>
+      <w:r>
+        <w:rPr>
+          <w:b/>
+          <w:sz w:val="21"/>
+        </w:rPr>
+        <w:t>另一个模型</w:t>
+      </w:r>
+      <w:r>
+        <w:rPr>
+          <w:sz w:val="21"/>
+        </w:rPr>
+        <w:t>在</w:t>
+      </w:r>
+      <w:r>
+        <w:rPr>
+          <w:b/>
+          <w:sz w:val="21"/>
+        </w:rPr>
+        <w:t>独立会话</w:t>
+      </w:r>
+      <w:r>
+        <w:rPr>
+          <w:sz w:val="21"/>
+        </w:rPr>
+        <w:t>里做，只看你的需求和产物文件，不看主模型怎么想；报告里会写「审者模型 / 隔离度」。查三件事：来源靠不靠谱（权威性）、数字引用有没有出处（真实性，会用工具机械核对文件行号与域名）、还有没有没覆盖到的坏场景（全面性）。</w:t>
+      </w:r>
+      <w:r>
+        <w:rPr>
+          <w:b/>
+          <w:sz w:val="21"/>
+        </w:rPr>
+        <w:t>代理关着就退回主模型自审，报告会标「隔离度：低」</w:t>
+      </w:r>
+      <w:r>
+        <w:rPr>
+          <w:sz w:val="21"/>
+        </w:rPr>
+        <w:t>——别把自审当隔离审。</w:t>
+      </w:r>
+    </w:p>
     <w:p>
       <w:r>
         <w:rPr>

</xml_diff>

<commit_message>
feat: verify_claims 支持回执核对（kind=ledger）+ 发布演练
- lib/verify.js：新增 kind=ledger，数落盘文件的 Markdown 表格数据行（跳过表头/分隔行），跟回执里的「N 候选」对账；支持 expect.candidates 相等、expect.min 下限、不给期望值只报数
- 导出 ledgerRows()；tools.js 工具描述与 schema 补 kind=ledger 与 expect
- test/ledger.test.mjs 5 项；总数 160 → 165
- npm pack --dry-run 演练：49 个文件 / 670.6kB，发布面仍是单文件 client.js
- 未动 SCHEMA：本轮无状态结构变化，强行 bump 只会让老会话白迁移
</commit_message>
<xml_diff>
--- a/docs/使用说明.docx
+++ b/docs/使用说明.docx
@@ -3066,7 +3066,20 @@
               <w:rPr>
                 <w:sz w:val="19"/>
               </w:rPr>
-              <w:t>机械核对「断言 ↔ 来源」：文件行号与数字/引号短语是否对得上、URL 域名分级；只证明「有对应源」，不证明源本身真实（只读、纯本地）</w:t>
+              <w:t>机械核对「断言 ↔ 来源」：文件行号与数字/引号短语是否对得上、URL 域名分级、</w:t>
+            </w:r>
+            <w:r>
+              <w:rPr>
+                <w:rFonts w:ascii="Consolas" w:hAnsi="Consolas"/>
+                <w:sz w:val="19"/>
+              </w:rPr>
+              <w:t>kind=ledger</w:t>
+            </w:r>
+            <w:r>
+              <w:rPr>
+                <w:sz w:val="19"/>
+              </w:rPr>
+              <w:t xml:space="preserve"> 把回执里的条目数与落盘文件的表格数据行对账（v3.7.0）；只证明「有对应源」，不证明源本身真实（只读、纯本地）</w:t>
             </w:r>
           </w:p>
         </w:tc>

</xml_diff>